<commit_message>
made changes to historical facts and ancient greece script.
</commit_message>
<xml_diff>
--- a/Documentation/Historical Facts.docx
+++ b/Documentation/Historical Facts.docx
@@ -502,12 +502,818 @@
         <w:pStyle w:val="Heading2"/>
         <w:rPr/>
       </w:pPr>
-      <w:bookmarkStart w:colFirst="0" w:colLast="0" w:name="_fycdvsqwnx7" w:id="5"/>
+      <w:bookmarkStart w:colFirst="0" w:colLast="0" w:name="_gxjmqjbht9dh" w:id="5"/>
       <w:bookmarkEnd w:id="5"/>
       <w:r>
         <w:rPr>
           <w:rtl w:val="0"/>
         </w:rPr>
+        <w:t xml:space="preserve">Hellenistic Period (323 BCE–31 BCE)</w:t>
+      </w:r>
+    </w:p>
+    <w:p>
+      <w:pPr>
+        <w:rPr/>
+      </w:pPr>
+      <w:r>
+        <w:rPr>
+          <w:rtl w:val="0"/>
+        </w:rPr>
+        <w:t xml:space="preserve">323 BCE: Alexander dies; empire splits into Ptolemaic Egypt, Seleucid Asia, and Antigonid Macedon.</w:t>
+      </w:r>
+    </w:p>
+    <w:p>
+      <w:pPr>
+        <w:rPr/>
+      </w:pPr>
+      <w:r>
+        <w:rPr>
+          <w:rtl w:val="0"/>
+        </w:rPr>
+        <w:t xml:space="preserve">3rd–2nd centuries BCE: Wars between successor kingdoms.</w:t>
+      </w:r>
+    </w:p>
+    <w:p>
+      <w:pPr>
+        <w:rPr/>
+      </w:pPr>
+      <w:r>
+        <w:rPr>
+          <w:rtl w:val="0"/>
+        </w:rPr>
+        <w:t xml:space="preserve">Greek culture spreads to Egypt (Alexandria’s Library), Persia, and India.</w:t>
+      </w:r>
+    </w:p>
+    <w:p>
+      <w:pPr>
+        <w:rPr/>
+      </w:pPr>
+      <w:r>
+        <w:rPr>
+          <w:rtl w:val="0"/>
+        </w:rPr>
+        <w:t xml:space="preserve">146 BCE: Rome conquers Greece (destruction of Corinth).</w:t>
+      </w:r>
+    </w:p>
+    <w:p>
+      <w:pPr>
+        <w:rPr/>
+      </w:pPr>
+      <w:r>
+        <w:rPr>
+          <w:rtl w:val="0"/>
+        </w:rPr>
+        <w:t xml:space="preserve">31 BCE: Battle of Actium – Rome defeats Cleopatra; end of Hellenistic era.</w:t>
+      </w:r>
+    </w:p>
+    <w:p>
+      <w:pPr>
+        <w:pStyle w:val="Heading2"/>
+        <w:rPr/>
+      </w:pPr>
+      <w:bookmarkStart w:colFirst="0" w:colLast="0" w:name="_r1wgdvywghce" w:id="6"/>
+      <w:bookmarkEnd w:id="6"/>
+      <w:r>
+        <w:rPr>
+          <w:rtl w:val="0"/>
+        </w:rPr>
+        <w:t xml:space="preserve">Roman Greece (146 BCE–330 CE)</w:t>
+      </w:r>
+    </w:p>
+    <w:p>
+      <w:pPr>
+        <w:rPr/>
+      </w:pPr>
+      <w:r>
+        <w:rPr>
+          <w:rtl w:val="0"/>
+        </w:rPr>
+        <w:t xml:space="preserve">Greece becomes part of the Roman Empire.</w:t>
+      </w:r>
+    </w:p>
+    <w:p>
+      <w:pPr>
+        <w:rPr/>
+      </w:pPr>
+      <w:r>
+        <w:rPr>
+          <w:rtl w:val="0"/>
+        </w:rPr>
+        <w:t xml:space="preserve">Greek culture influences Rome (philosophy, art, literature).</w:t>
+      </w:r>
+    </w:p>
+    <w:p>
+      <w:pPr>
+        <w:rPr/>
+      </w:pPr>
+      <w:r>
+        <w:rPr>
+          <w:rtl w:val="0"/>
+        </w:rPr>
+        <w:t xml:space="preserve">Second Sophistic (Greek cultural revival under Roman rule).</w:t>
+      </w:r>
+    </w:p>
+    <w:p>
+      <w:pPr>
+        <w:rPr/>
+      </w:pPr>
+      <w:r>
+        <w:rPr>
+          <w:rtl w:val="0"/>
+        </w:rPr>
+      </w:r>
+    </w:p>
+    <w:p>
+      <w:pPr>
+        <w:pStyle w:val="Title"/>
+        <w:rPr/>
+      </w:pPr>
+      <w:bookmarkStart w:colFirst="0" w:colLast="0" w:name="_bpqk89hqsec5" w:id="7"/>
+      <w:bookmarkEnd w:id="7"/>
+      <w:r>
+        <w:rPr>
+          <w:rtl w:val="0"/>
+        </w:rPr>
+        <w:t xml:space="preserve">Ancient Persia </w:t>
+      </w:r>
+    </w:p>
+    <w:p>
+      <w:pPr>
+        <w:pStyle w:val="Heading1"/>
+        <w:rPr/>
+      </w:pPr>
+      <w:bookmarkStart w:colFirst="0" w:colLast="0" w:name="_dzvfj7d98nup" w:id="8"/>
+      <w:bookmarkEnd w:id="8"/>
+      <w:r>
+        <w:rPr>
+          <w:rtl w:val="0"/>
+        </w:rPr>
+        <w:t xml:space="preserve">Early Persia - The Elamite Period </w:t>
+      </w:r>
+    </w:p>
+    <w:p>
+      <w:pPr>
+        <w:rPr/>
+      </w:pPr>
+      <w:r>
+        <w:rPr>
+          <w:rtl w:val="0"/>
+        </w:rPr>
+        <w:t xml:space="preserve">The area of modern-day Iran, in historical Persia, has been inhabited since early pre-history. It contained the earliest agricultural villages in 7200BC in the Zagros Mountains. A 7000-year-old wine was found in this area. This region was deeply intertwined with Mesopotamia (aka Iraq). Iran bordered the land of Mesopotamia, and the earliest kingdom which arose in Iran, Elam, is the first historical record. The Persians, a tribe of the Iranian people who formed a branch of the Indo-European speaking peoples. </w:t>
+      </w:r>
+    </w:p>
+    <w:p>
+      <w:pPr>
+        <w:numPr>
+          <w:ilvl w:val="0"/>
+          <w:numId w:val="5"/>
+        </w:numPr>
+        <w:ind w:left="720" w:hanging="360"/>
+        <w:rPr>
+          <w:u w:val="none"/>
+        </w:rPr>
+      </w:pPr>
+      <w:r>
+        <w:rPr>
+          <w:rtl w:val="0"/>
+        </w:rPr>
+        <w:t xml:space="preserve">Around 3200 BC, the Elamites built their civilization in the city of Susa (the capital of Elam) - The first defined nation of what would become Persia. It is important center of trade and wealth until its destruction by the Mongols 5500 years later.</w:t>
+      </w:r>
+    </w:p>
+    <w:p>
+      <w:pPr>
+        <w:numPr>
+          <w:ilvl w:val="0"/>
+          <w:numId w:val="5"/>
+        </w:numPr>
+        <w:ind w:left="720" w:hanging="360"/>
+        <w:rPr>
+          <w:u w:val="none"/>
+        </w:rPr>
+      </w:pPr>
+      <w:r>
+        <w:rPr>
+          <w:rtl w:val="0"/>
+        </w:rPr>
+        <w:t xml:space="preserve">They developed one of the world’s earliest writing systems - the Proto-Elamite script. Which we are still unable to translate. Their language was completely different than that of any other region </w:t>
+      </w:r>
+    </w:p>
+    <w:p>
+      <w:pPr>
+        <w:numPr>
+          <w:ilvl w:val="0"/>
+          <w:numId w:val="5"/>
+        </w:numPr>
+        <w:ind w:left="720" w:hanging="360"/>
+        <w:rPr>
+          <w:u w:val="none"/>
+        </w:rPr>
+      </w:pPr>
+      <w:r>
+        <w:rPr>
+          <w:rtl w:val="0"/>
+        </w:rPr>
+        <w:t xml:space="preserve">Their culture, based on their art, had a great respect for women. They were seen as equal in art and queens were shown as equal to the king. </w:t>
+      </w:r>
+    </w:p>
+    <w:p>
+      <w:pPr>
+        <w:numPr>
+          <w:ilvl w:val="0"/>
+          <w:numId w:val="5"/>
+        </w:numPr>
+        <w:ind w:left="720" w:hanging="360"/>
+        <w:rPr>
+          <w:u w:val="none"/>
+        </w:rPr>
+      </w:pPr>
+      <w:r>
+        <w:rPr>
+          <w:rtl w:val="0"/>
+        </w:rPr>
+        <w:t xml:space="preserve">The land was mountainous so life was structured around semi-pastoralism with a bit of agriculture at the bottom of the valley. This made them hardier people compared to those of the plain. </w:t>
+      </w:r>
+    </w:p>
+    <w:p>
+      <w:pPr>
+        <w:numPr>
+          <w:ilvl w:val="0"/>
+          <w:numId w:val="5"/>
+        </w:numPr>
+        <w:ind w:left="720" w:hanging="360"/>
+        <w:rPr>
+          <w:u w:val="none"/>
+        </w:rPr>
+      </w:pPr>
+      <w:r>
+        <w:rPr>
+          <w:rtl w:val="0"/>
+        </w:rPr>
+        <w:t xml:space="preserve">Elam and Babylon constantly fought. They lost the first war with the invasion and looting by the sumerians in 2700 BC</w:t>
+      </w:r>
+    </w:p>
+    <w:p>
+      <w:pPr>
+        <w:numPr>
+          <w:ilvl w:val="0"/>
+          <w:numId w:val="5"/>
+        </w:numPr>
+        <w:ind w:left="720" w:hanging="360"/>
+        <w:rPr>
+          <w:u w:val="none"/>
+        </w:rPr>
+      </w:pPr>
+      <w:r>
+        <w:rPr>
+          <w:rtl w:val="0"/>
+        </w:rPr>
+        <w:t xml:space="preserve">Sargon of Achad took back Elam and by 1100 BC Elam was the rising power in the region. and then King Shutruk Nahunti went on a series of conquests, ruling over most of the cities around Babylon. Due to infighting between King Shutruk’s heirs, the king of babylon, Nebuchadnezzar would conquer it in 1120 BC.</w:t>
+      </w:r>
+    </w:p>
+    <w:p>
+      <w:pPr>
+        <w:numPr>
+          <w:ilvl w:val="0"/>
+          <w:numId w:val="5"/>
+        </w:numPr>
+        <w:ind w:left="720" w:hanging="360"/>
+        <w:rPr>
+          <w:u w:val="none"/>
+        </w:rPr>
+      </w:pPr>
+      <w:r>
+        <w:rPr>
+          <w:rtl w:val="0"/>
+        </w:rPr>
+        <w:t xml:space="preserve">Elam’s power faded with the settling of the Iranina, Aryan, people into the region. They originated form the steps Eurasia and were nomads. They lived a life similar to that Mongols. Over time, Elam and Iranians started to mix. Although the Elamite language was used, for a long time, as the administrative language. </w:t>
+      </w:r>
+    </w:p>
+    <w:p>
+      <w:pPr>
+        <w:rPr/>
+      </w:pPr>
+      <w:r>
+        <w:rPr>
+          <w:rtl w:val="0"/>
+        </w:rPr>
+      </w:r>
+    </w:p>
+    <w:p>
+      <w:pPr>
+        <w:numPr>
+          <w:ilvl w:val="0"/>
+          <w:numId w:val="4"/>
+        </w:numPr>
+        <w:ind w:left="720" w:hanging="360"/>
+        <w:rPr>
+          <w:u w:val="none"/>
+        </w:rPr>
+      </w:pPr>
+      <w:r>
+        <w:rPr>
+          <w:rtl w:val="0"/>
+        </w:rPr>
+        <w:t xml:space="preserve">Then came the Medes, an Iranian people who settled in the western highlands</w:t>
+      </w:r>
+    </w:p>
+    <w:p>
+      <w:pPr>
+        <w:numPr>
+          <w:ilvl w:val="0"/>
+          <w:numId w:val="4"/>
+        </w:numPr>
+        <w:ind w:left="720" w:hanging="360"/>
+        <w:rPr>
+          <w:u w:val="none"/>
+        </w:rPr>
+      </w:pPr>
+      <w:r>
+        <w:rPr>
+          <w:rtl w:val="0"/>
+        </w:rPr>
+        <w:t xml:space="preserve">The Medes united the scattered Iranian tribes into a kingdom. They united under the the leadership of their first Emperor, Deioces(727-675 BC) The unification was largely a reaction to the brutal conquest and oppression by the Assyrina Empire. Deioces’ grandson later overthrew the mighty Assyrian Empire alongside the Babylonians in 612 BC</w:t>
+      </w:r>
+    </w:p>
+    <w:p>
+      <w:pPr>
+        <w:numPr>
+          <w:ilvl w:val="0"/>
+          <w:numId w:val="4"/>
+        </w:numPr>
+        <w:ind w:left="720" w:hanging="360"/>
+        <w:rPr>
+          <w:u w:val="none"/>
+        </w:rPr>
+      </w:pPr>
+      <w:r>
+        <w:rPr>
+          <w:rtl w:val="0"/>
+        </w:rPr>
+        <w:t xml:space="preserve">The Medes wouldn’t hold power forever. A young prince from the Persian tribe, Cyrus, of Anshan was about to change everything.  </w:t>
+      </w:r>
+    </w:p>
+    <w:p>
+      <w:pPr>
+        <w:rPr/>
+      </w:pPr>
+      <w:r>
+        <w:rPr/>
+        <w:drawing>
+          <wp:inline distB="114300" distT="114300" distL="114300" distR="114300">
+            <wp:extent cx="3485708" cy="4093386"/>
+            <wp:effectExtent b="0" l="0" r="0" t="0"/>
+            <wp:docPr id="1" name="image1.png"/>
+            <a:graphic>
+              <a:graphicData uri="http://schemas.openxmlformats.org/drawingml/2006/picture">
+                <pic:pic>
+                  <pic:nvPicPr>
+                    <pic:cNvPr id="0" name="image1.png"/>
+                    <pic:cNvPicPr preferRelativeResize="0"/>
+                  </pic:nvPicPr>
+                  <pic:blipFill>
+                    <a:blip r:embed="rId6"/>
+                    <a:srcRect b="0" l="0" r="0" t="0"/>
+                    <a:stretch>
+                      <a:fillRect/>
+                    </a:stretch>
+                  </pic:blipFill>
+                  <pic:spPr>
+                    <a:xfrm>
+                      <a:off x="0" y="0"/>
+                      <a:ext cx="3485708" cy="4093386"/>
+                    </a:xfrm>
+                    <a:prstGeom prst="rect"/>
+                    <a:ln/>
+                  </pic:spPr>
+                </pic:pic>
+              </a:graphicData>
+            </a:graphic>
+          </wp:inline>
+        </w:drawing>
+      </w:r>
+      <w:r>
+        <w:rPr>
+          <w:rtl w:val="0"/>
+        </w:rPr>
+      </w:r>
+    </w:p>
+    <w:p>
+      <w:pPr>
+        <w:rPr/>
+      </w:pPr>
+      <w:r>
+        <w:rPr>
+          <w:rtl w:val="0"/>
+        </w:rPr>
+      </w:r>
+    </w:p>
+    <w:p>
+      <w:pPr>
+        <w:pStyle w:val="Heading1"/>
+        <w:rPr/>
+      </w:pPr>
+      <w:bookmarkStart w:colFirst="0" w:colLast="0" w:name="_7tdvbd9biteq" w:id="9"/>
+      <w:bookmarkEnd w:id="9"/>
+      <w:r>
+        <w:rPr>
+          <w:rtl w:val="0"/>
+        </w:rPr>
+        <w:t xml:space="preserve">The Rise of Cyrus the Great</w:t>
+      </w:r>
+    </w:p>
+    <w:p>
+      <w:pPr>
+        <w:numPr>
+          <w:ilvl w:val="0"/>
+          <w:numId w:val="1"/>
+        </w:numPr>
+        <w:ind w:left="720" w:hanging="360"/>
+      </w:pPr>
+      <w:r>
+        <w:rPr>
+          <w:rtl w:val="0"/>
+        </w:rPr>
+        <w:t xml:space="preserve">They overthrew the mighty Assyrian Empire alongside the Babylonians in 612 BC</w:t>
+      </w:r>
+    </w:p>
+    <w:p>
+      <w:pPr>
+        <w:numPr>
+          <w:ilvl w:val="0"/>
+          <w:numId w:val="1"/>
+        </w:numPr>
+        <w:ind w:left="720" w:hanging="360"/>
+      </w:pPr>
+      <w:r>
+        <w:rPr>
+          <w:rtl w:val="0"/>
+        </w:rPr>
+        <w:t xml:space="preserve">The Medes wouldn’t hold power forever. A young prince from the Persian tribe, Cyrus, of Anshan was about to change everything.  Cyrus the Great was teh founder of the First Persian empire, also known as the Achaemenid Empire. He was initially a vassal of the Median Empire. Cyrus eventually rebelled against his Median overlords in 553 BC teaming up with a Median general named Harpagus to overthrow them. </w:t>
+      </w:r>
+    </w:p>
+    <w:p>
+      <w:pPr>
+        <w:numPr>
+          <w:ilvl w:val="0"/>
+          <w:numId w:val="1"/>
+        </w:numPr>
+        <w:ind w:left="720" w:hanging="360"/>
+        <w:rPr>
+          <w:u w:val="none"/>
+        </w:rPr>
+      </w:pPr>
+      <w:r>
+        <w:rPr>
+          <w:rtl w:val="0"/>
+        </w:rPr>
+        <w:t xml:space="preserve">Cyrus was born to the royal house of Anshan, a vassal of the Median Empire. Around 550 BCE, Cyrus II, leader of the Achaemenid family united the Persian tribes and led a successful rebellion against the Meidan King Astyages. </w:t>
+      </w:r>
+    </w:p>
+    <w:p>
+      <w:pPr>
+        <w:numPr>
+          <w:ilvl w:val="0"/>
+          <w:numId w:val="1"/>
+        </w:numPr>
+        <w:ind w:left="720" w:hanging="360"/>
+        <w:rPr>
+          <w:u w:val="none"/>
+        </w:rPr>
+      </w:pPr>
+      <w:r>
+        <w:rPr>
+          <w:rtl w:val="0"/>
+        </w:rPr>
+        <w:t xml:space="preserve">Cyrus expanded its borders to take in the whole of Asia Minor, Syria, Palestine, and Mesopotamia. The last three regions had belonged to the Babylonian empire before succumbing to Cyrus’ forces.</w:t>
+      </w:r>
+    </w:p>
+    <w:p>
+      <w:pPr>
+        <w:numPr>
+          <w:ilvl w:val="0"/>
+          <w:numId w:val="1"/>
+        </w:numPr>
+        <w:ind w:left="720" w:hanging="360"/>
+        <w:rPr>
+          <w:u w:val="none"/>
+        </w:rPr>
+      </w:pPr>
+      <w:r>
+        <w:rPr>
+          <w:rtl w:val="0"/>
+        </w:rPr>
+        <w:t xml:space="preserve">Cyrus and his successors, Cambyses II and Darius I, engaged in rapid expansion, creating the first multi-state empire that spanned from the Indus River to Egypt and the Mediterranean. Cambyses conquered Egypt, and his successor Darius the Great brought the Persian empire to the height of its power by conqueirng a large slice of central Asia and western India. Darius also reorganized the empire’s government and placed it on firm foundations. </w:t>
+      </w:r>
+    </w:p>
+    <w:p>
+      <w:pPr>
+        <w:numPr>
+          <w:ilvl w:val="0"/>
+          <w:numId w:val="1"/>
+        </w:numPr>
+        <w:ind w:left="720" w:hanging="360"/>
+        <w:rPr>
+          <w:u w:val="none"/>
+        </w:rPr>
+      </w:pPr>
+      <w:r>
+        <w:rPr>
+          <w:rtl w:val="0"/>
+        </w:rPr>
+        <w:t xml:space="preserve">By 475 BCE, the Achaemenid Empire ruled over 44% of the world’s population, the highest figure for any empire in history.  </w:t>
+      </w:r>
+    </w:p>
+    <w:p>
+      <w:pPr>
+        <w:rPr/>
+      </w:pPr>
+      <w:r>
+        <w:rPr>
+          <w:rtl w:val="0"/>
+        </w:rPr>
+      </w:r>
+    </w:p>
+    <w:p>
+      <w:pPr>
+        <w:pStyle w:val="Heading1"/>
+        <w:rPr/>
+      </w:pPr>
+      <w:bookmarkStart w:colFirst="0" w:colLast="0" w:name="_tuvejf7kfvzc" w:id="10"/>
+      <w:bookmarkEnd w:id="10"/>
+      <w:r>
+        <w:rPr>
+          <w:rtl w:val="0"/>
+        </w:rPr>
+        <w:t xml:space="preserve">The Fall of Babylon </w:t>
+      </w:r>
+    </w:p>
+    <w:p>
+      <w:pPr>
+        <w:numPr>
+          <w:ilvl w:val="0"/>
+          <w:numId w:val="2"/>
+        </w:numPr>
+        <w:ind w:left="720" w:hanging="360"/>
+        <w:rPr>
+          <w:u w:val="none"/>
+        </w:rPr>
+      </w:pPr>
+      <w:r>
+        <w:rPr>
+          <w:rtl w:val="0"/>
+        </w:rPr>
+        <w:t xml:space="preserve">In the year 539 BC, the people of Jerusalem (The Kingdom of Judah) are in exile in babylon and have been prisoners for 50 years after the destruction of Jerusalem and the destruction of the temple built by King Solomon. </w:t>
+      </w:r>
+    </w:p>
+    <w:p>
+      <w:pPr>
+        <w:numPr>
+          <w:ilvl w:val="0"/>
+          <w:numId w:val="2"/>
+        </w:numPr>
+        <w:ind w:left="720" w:hanging="360"/>
+        <w:rPr>
+          <w:u w:val="none"/>
+        </w:rPr>
+      </w:pPr>
+      <w:r>
+        <w:rPr>
+          <w:rtl w:val="0"/>
+        </w:rPr>
+        <w:t xml:space="preserve">Cyrus the Great conquered Babylon by diverting the Euphrates river to enter the city with minimal resistance, ending 70 years of Jewish captivity. He liberated the Jewish peopel by issuing a royal decree in 538 BC, allowing them to return to Jerusalem and rebuild their temple.</w:t>
+      </w:r>
+    </w:p>
+    <w:p>
+      <w:pPr>
+        <w:numPr>
+          <w:ilvl w:val="0"/>
+          <w:numId w:val="2"/>
+        </w:numPr>
+        <w:ind w:left="720" w:hanging="360"/>
+        <w:rPr>
+          <w:u w:val="none"/>
+        </w:rPr>
+      </w:pPr>
+      <w:r>
+        <w:rPr>
+          <w:rtl w:val="0"/>
+        </w:rPr>
+        <w:t xml:space="preserve">Cyrus the great freed the Jewish people from their captivity and allowed them to go home, rebuild their temples and practice their faith.</w:t>
+      </w:r>
+    </w:p>
+    <w:p>
+      <w:pPr>
+        <w:numPr>
+          <w:ilvl w:val="0"/>
+          <w:numId w:val="2"/>
+        </w:numPr>
+        <w:ind w:left="720" w:hanging="360"/>
+        <w:rPr>
+          <w:u w:val="none"/>
+        </w:rPr>
+      </w:pPr>
+      <w:r>
+        <w:rPr>
+          <w:rtl w:val="0"/>
+        </w:rPr>
+        <w:t xml:space="preserve">Cyrus was seen as a liberator by the Babylonians, who were tired of their rulers. </w:t>
+      </w:r>
+    </w:p>
+    <w:p>
+      <w:pPr>
+        <w:pStyle w:val="Heading1"/>
+        <w:rPr/>
+      </w:pPr>
+      <w:bookmarkStart w:colFirst="0" w:colLast="0" w:name="_qpuuiy28yfac" w:id="11"/>
+      <w:bookmarkEnd w:id="11"/>
+      <w:r>
+        <w:rPr>
+          <w:rtl w:val="0"/>
+        </w:rPr>
+        <w:t xml:space="preserve">The Cyrus Cylinder and legacy</w:t>
+      </w:r>
+    </w:p>
+    <w:p>
+      <w:pPr>
+        <w:numPr>
+          <w:ilvl w:val="0"/>
+          <w:numId w:val="6"/>
+        </w:numPr>
+        <w:ind w:left="720" w:hanging="360"/>
+        <w:rPr>
+          <w:u w:val="none"/>
+        </w:rPr>
+      </w:pPr>
+      <w:r>
+        <w:rPr>
+          <w:rtl w:val="0"/>
+        </w:rPr>
+        <w:t xml:space="preserve">The Cyrus Cylinder is a small clay artifact created after Cyrus the Great conquered Babylon that declares the rightful ruler of babylon, criticizes the previous king of babylon, it describes how Cyrus restored order and peace, it describes his support of rebuilding temples and respecting local regions and it mentions that he returned misplaced people to their homeland. </w:t>
+      </w:r>
+    </w:p>
+    <w:p>
+      <w:pPr>
+        <w:numPr>
+          <w:ilvl w:val="0"/>
+          <w:numId w:val="6"/>
+        </w:numPr>
+        <w:ind w:left="720" w:hanging="360"/>
+        <w:rPr>
+          <w:u w:val="none"/>
+        </w:rPr>
+      </w:pPr>
+      <w:r>
+        <w:rPr>
+          <w:rtl w:val="0"/>
+        </w:rPr>
+        <w:t xml:space="preserve">The Cyrus cylinder is one of the most important documents from the ancient world. </w:t>
+      </w:r>
+    </w:p>
+    <w:p>
+      <w:pPr>
+        <w:numPr>
+          <w:ilvl w:val="0"/>
+          <w:numId w:val="6"/>
+        </w:numPr>
+        <w:ind w:left="720" w:hanging="360"/>
+        <w:rPr>
+          <w:u w:val="none"/>
+        </w:rPr>
+      </w:pPr>
+      <w:r>
+        <w:rPr>
+          <w:rtl w:val="0"/>
+        </w:rPr>
+        <w:t xml:space="preserve">The reason why it’s so important is because it depicts a different style of ruling compared to other conquerors. </w:t>
+      </w:r>
+    </w:p>
+    <w:p>
+      <w:pPr>
+        <w:numPr>
+          <w:ilvl w:val="0"/>
+          <w:numId w:val="6"/>
+        </w:numPr>
+        <w:ind w:left="720" w:hanging="360"/>
+        <w:rPr>
+          <w:u w:val="none"/>
+        </w:rPr>
+      </w:pPr>
+      <w:r>
+        <w:rPr>
+          <w:rtl w:val="0"/>
+        </w:rPr>
+        <w:t xml:space="preserve">The cylinder can be found int he British Museum.</w:t>
+      </w:r>
+    </w:p>
+    <w:p>
+      <w:pPr>
+        <w:numPr>
+          <w:ilvl w:val="0"/>
+          <w:numId w:val="6"/>
+        </w:numPr>
+        <w:ind w:left="720" w:hanging="360"/>
+        <w:rPr>
+          <w:u w:val="none"/>
+        </w:rPr>
+      </w:pPr>
+      <w:r>
+        <w:rPr>
+          <w:rtl w:val="0"/>
+        </w:rPr>
+        <w:t xml:space="preserve">Cyrus the Great’s Legacy </w:t>
+      </w:r>
+    </w:p>
+    <w:p>
+      <w:pPr>
+        <w:numPr>
+          <w:ilvl w:val="1"/>
+          <w:numId w:val="6"/>
+        </w:numPr>
+        <w:ind w:left="1440" w:hanging="360"/>
+        <w:rPr>
+          <w:u w:val="none"/>
+        </w:rPr>
+      </w:pPr>
+      <w:r>
+        <w:rPr>
+          <w:rtl w:val="0"/>
+        </w:rPr>
+        <w:t xml:space="preserve">Built one of the largest empires in the ancient world</w:t>
+      </w:r>
+    </w:p>
+    <w:p>
+      <w:pPr>
+        <w:numPr>
+          <w:ilvl w:val="1"/>
+          <w:numId w:val="6"/>
+        </w:numPr>
+        <w:ind w:left="1440" w:hanging="360"/>
+        <w:rPr>
+          <w:u w:val="none"/>
+        </w:rPr>
+      </w:pPr>
+      <w:r>
+        <w:rPr>
+          <w:rtl w:val="0"/>
+        </w:rPr>
+        <w:t xml:space="preserve">He permitted religious tolerance - allowing conquered people to keep their customs and beliefs and allowing the exiled jews to return to Jerusalem</w:t>
+      </w:r>
+    </w:p>
+    <w:p>
+      <w:pPr>
+        <w:numPr>
+          <w:ilvl w:val="1"/>
+          <w:numId w:val="6"/>
+        </w:numPr>
+        <w:ind w:left="1440" w:hanging="360"/>
+        <w:rPr>
+          <w:u w:val="none"/>
+        </w:rPr>
+      </w:pPr>
+      <w:r>
+        <w:rPr>
+          <w:rtl w:val="0"/>
+        </w:rPr>
+        <w:t xml:space="preserve">Instead of ruling with fear, he promoted stability through respect</w:t>
+      </w:r>
+    </w:p>
+    <w:p>
+      <w:pPr>
+        <w:pStyle w:val="Heading2"/>
+        <w:rPr/>
+      </w:pPr>
+      <w:bookmarkStart w:colFirst="0" w:colLast="0" w:name="_kolyfhjzkyqp" w:id="12"/>
+      <w:bookmarkEnd w:id="12"/>
+      <w:r>
+        <w:rPr>
+          <w:rtl w:val="0"/>
+        </w:rPr>
+      </w:r>
+    </w:p>
+    <w:p>
+      <w:pPr>
+        <w:pStyle w:val="Heading2"/>
+        <w:rPr/>
+      </w:pPr>
+      <w:bookmarkStart w:colFirst="0" w:colLast="0" w:name="_mueduhyen55r" w:id="13"/>
+      <w:bookmarkEnd w:id="13"/>
+      <w:r>
+        <w:rPr>
+          <w:rtl w:val="0"/>
+        </w:rPr>
+      </w:r>
+    </w:p>
+    <w:p>
+      <w:pPr>
+        <w:pStyle w:val="Heading2"/>
+        <w:rPr/>
+      </w:pPr>
+      <w:bookmarkStart w:colFirst="0" w:colLast="0" w:name="_fycdvsqwnx7" w:id="14"/>
+      <w:bookmarkEnd w:id="14"/>
+      <w:r>
+        <w:rPr>
+          <w:rtl w:val="0"/>
+        </w:rPr>
         <w:t xml:space="preserve">Resources</w:t>
       </w:r>
     </w:p>
@@ -515,7 +1321,7 @@
       <w:pPr>
         <w:rPr/>
       </w:pPr>
-      <w:hyperlink r:id="rId6">
+      <w:hyperlink r:id="rId7">
         <w:r>
           <w:rPr>
             <w:color w:val="1155cc"/>
@@ -535,7 +1341,7 @@
       <w:pPr>
         <w:rPr/>
       </w:pPr>
-      <w:hyperlink r:id="rId7">
+      <w:hyperlink r:id="rId8">
         <w:r>
           <w:rPr>
             <w:color w:val="1155cc"/>
@@ -556,7 +1362,7 @@
       <w:pPr>
         <w:rPr/>
       </w:pPr>
-      <w:hyperlink r:id="rId8">
+      <w:hyperlink r:id="rId9">
         <w:r>
           <w:rPr>
             <w:color w:val="1155cc"/>
@@ -572,6 +1378,122 @@
         </w:rPr>
         <w:t xml:space="preserve"> </w:t>
       </w:r>
+    </w:p>
+    <w:p>
+      <w:pPr>
+        <w:rPr/>
+      </w:pPr>
+      <w:r>
+        <w:rPr>
+          <w:rtl w:val="0"/>
+        </w:rPr>
+      </w:r>
+    </w:p>
+    <w:p>
+      <w:pPr>
+        <w:rPr/>
+      </w:pPr>
+      <w:r>
+        <w:rPr>
+          <w:rtl w:val="0"/>
+        </w:rPr>
+        <w:t xml:space="preserve">Ancient Persia</w:t>
+      </w:r>
+    </w:p>
+    <w:p>
+      <w:pPr>
+        <w:numPr>
+          <w:ilvl w:val="0"/>
+          <w:numId w:val="3"/>
+        </w:numPr>
+        <w:ind w:left="720" w:hanging="360"/>
+        <w:rPr>
+          <w:u w:val="none"/>
+        </w:rPr>
+      </w:pPr>
+      <w:hyperlink r:id="rId10">
+        <w:r>
+          <w:rPr>
+            <w:color w:val="1155cc"/>
+            <w:u w:val="single"/>
+            <w:rtl w:val="0"/>
+          </w:rPr>
+          <w:t xml:space="preserve">https://www.youtube.com/watch?v=5EtbBU0beus&amp;t=108s</w:t>
+        </w:r>
+      </w:hyperlink>
+      <w:r>
+        <w:rPr>
+          <w:rtl w:val="0"/>
+        </w:rPr>
+        <w:t xml:space="preserve"> </w:t>
+      </w:r>
+    </w:p>
+    <w:p>
+      <w:pPr>
+        <w:numPr>
+          <w:ilvl w:val="0"/>
+          <w:numId w:val="3"/>
+        </w:numPr>
+        <w:ind w:left="720" w:hanging="360"/>
+        <w:rPr>
+          <w:u w:val="none"/>
+        </w:rPr>
+      </w:pPr>
+      <w:hyperlink r:id="rId11">
+        <w:r>
+          <w:rPr>
+            <w:color w:val="1155cc"/>
+            <w:u w:val="single"/>
+            <w:rtl w:val="0"/>
+          </w:rPr>
+          <w:t xml:space="preserve">https://education.nationalgeographic.org/resource/persian-empire/</w:t>
+        </w:r>
+      </w:hyperlink>
+      <w:r>
+        <w:rPr>
+          <w:rtl w:val="0"/>
+        </w:rPr>
+        <w:t xml:space="preserve"> </w:t>
+      </w:r>
+    </w:p>
+    <w:p>
+      <w:pPr>
+        <w:numPr>
+          <w:ilvl w:val="0"/>
+          <w:numId w:val="3"/>
+        </w:numPr>
+        <w:ind w:left="720" w:hanging="360"/>
+        <w:rPr>
+          <w:u w:val="none"/>
+        </w:rPr>
+      </w:pPr>
+      <w:hyperlink r:id="rId12">
+        <w:r>
+          <w:rPr>
+            <w:color w:val="1155cc"/>
+            <w:u w:val="single"/>
+            <w:rtl w:val="0"/>
+          </w:rPr>
+          <w:t xml:space="preserve">https://timemaps.com/civilizations/ancient-persia/</w:t>
+        </w:r>
+      </w:hyperlink>
+      <w:r>
+        <w:rPr>
+          <w:rtl w:val="0"/>
+        </w:rPr>
+      </w:r>
+    </w:p>
+    <w:p>
+      <w:pPr>
+        <w:numPr>
+          <w:ilvl w:val="0"/>
+          <w:numId w:val="3"/>
+        </w:numPr>
+        <w:ind w:left="720" w:hanging="360"/>
+        <w:rPr>
+          <w:u w:val="none"/>
+        </w:rPr>
+      </w:pPr>
       <w:r>
         <w:rPr>
           <w:rtl w:val="0"/>
@@ -628,7 +1550,686 @@
 </file>
 
 <file path=word/numbering.xml><?xml version="1.0" encoding="utf-8"?>
-<w:numbering xmlns:mc="http://schemas.openxmlformats.org/markup-compatibility/2006" xmlns:o="urn:schemas-microsoft-com:office:office" xmlns:r="http://schemas.openxmlformats.org/officeDocument/2006/relationships" xmlns:m="http://schemas.openxmlformats.org/officeDocument/2006/math" xmlns:v="urn:schemas-microsoft-com:vml" xmlns:wp="http://schemas.openxmlformats.org/drawingml/2006/wordprocessingDrawing" xmlns:w10="urn:schemas-microsoft-com:office:word" xmlns:w="http://schemas.openxmlformats.org/wordprocessingml/2006/main" xmlns:wne="http://schemas.microsoft.com/office/word/2006/wordml" xmlns:sl="http://schemas.openxmlformats.org/schemaLibrary/2006/main" xmlns:a="http://schemas.openxmlformats.org/drawingml/2006/main" xmlns:pic="http://schemas.openxmlformats.org/drawingml/2006/picture" xmlns:c="http://schemas.openxmlformats.org/drawingml/2006/chart" xmlns:lc="http://schemas.openxmlformats.org/drawingml/2006/lockedCanvas" xmlns:dgm="http://schemas.openxmlformats.org/drawingml/2006/diagram" xmlns:wps="http://schemas.microsoft.com/office/word/2010/wordprocessingShape" xmlns:wpg="http://schemas.microsoft.com/office/word/2010/wordprocessingGroup" xmlns:w14="http://schemas.microsoft.com/office/word/2010/wordml" xmlns:w15="http://schemas.microsoft.com/office/word/2012/wordml" xmlns:w16="http://schemas.microsoft.com/office/word/2018/wordml" xmlns:w16cex="http://schemas.microsoft.com/office/word/2018/wordml/cex" xmlns:w16cid="http://schemas.microsoft.com/office/word/2016/wordml/cid" xmlns="http://schemas.microsoft.com/office/tasks/2019/documenttasks" xmlns:cr="http://schemas.microsoft.com/office/comments/2020/reactions"/>
+<w:numbering xmlns:mc="http://schemas.openxmlformats.org/markup-compatibility/2006" xmlns:o="urn:schemas-microsoft-com:office:office" xmlns:r="http://schemas.openxmlformats.org/officeDocument/2006/relationships" xmlns:m="http://schemas.openxmlformats.org/officeDocument/2006/math" xmlns:v="urn:schemas-microsoft-com:vml" xmlns:wp="http://schemas.openxmlformats.org/drawingml/2006/wordprocessingDrawing" xmlns:w10="urn:schemas-microsoft-com:office:word" xmlns:w="http://schemas.openxmlformats.org/wordprocessingml/2006/main" xmlns:wne="http://schemas.microsoft.com/office/word/2006/wordml" xmlns:sl="http://schemas.openxmlformats.org/schemaLibrary/2006/main" xmlns:a="http://schemas.openxmlformats.org/drawingml/2006/main" xmlns:pic="http://schemas.openxmlformats.org/drawingml/2006/picture" xmlns:c="http://schemas.openxmlformats.org/drawingml/2006/chart" xmlns:lc="http://schemas.openxmlformats.org/drawingml/2006/lockedCanvas" xmlns:dgm="http://schemas.openxmlformats.org/drawingml/2006/diagram" xmlns:wps="http://schemas.microsoft.com/office/word/2010/wordprocessingShape" xmlns:wpg="http://schemas.microsoft.com/office/word/2010/wordprocessingGroup" xmlns:w14="http://schemas.microsoft.com/office/word/2010/wordml" xmlns:w15="http://schemas.microsoft.com/office/word/2012/wordml" xmlns:w16="http://schemas.microsoft.com/office/word/2018/wordml" xmlns:w16cex="http://schemas.microsoft.com/office/word/2018/wordml/cex" xmlns:w16cid="http://schemas.microsoft.com/office/word/2016/wordml/cid" xmlns="http://schemas.microsoft.com/office/tasks/2019/documenttasks" xmlns:cr="http://schemas.microsoft.com/office/comments/2020/reactions">
+  <w:abstractNum w:abstractNumId="1">
+    <w:lvl w:ilvl="0">
+      <w:start w:val="1"/>
+      <w:numFmt w:val="bullet"/>
+      <w:lvlText w:val="●"/>
+      <w:lvlJc w:val="left"/>
+      <w:pPr>
+        <w:ind w:left="720" w:hanging="360"/>
+      </w:pPr>
+      <w:rPr>
+        <w:u w:val="none"/>
+      </w:rPr>
+    </w:lvl>
+    <w:lvl w:ilvl="1">
+      <w:start w:val="1"/>
+      <w:numFmt w:val="bullet"/>
+      <w:lvlText w:val="○"/>
+      <w:lvlJc w:val="left"/>
+      <w:pPr>
+        <w:ind w:left="1440" w:hanging="360"/>
+      </w:pPr>
+      <w:rPr>
+        <w:u w:val="none"/>
+      </w:rPr>
+    </w:lvl>
+    <w:lvl w:ilvl="2">
+      <w:start w:val="1"/>
+      <w:numFmt w:val="bullet"/>
+      <w:lvlText w:val="■"/>
+      <w:lvlJc w:val="left"/>
+      <w:pPr>
+        <w:ind w:left="2160" w:hanging="360"/>
+      </w:pPr>
+      <w:rPr>
+        <w:u w:val="none"/>
+      </w:rPr>
+    </w:lvl>
+    <w:lvl w:ilvl="3">
+      <w:start w:val="1"/>
+      <w:numFmt w:val="bullet"/>
+      <w:lvlText w:val="●"/>
+      <w:lvlJc w:val="left"/>
+      <w:pPr>
+        <w:ind w:left="2880" w:hanging="360"/>
+      </w:pPr>
+      <w:rPr>
+        <w:u w:val="none"/>
+      </w:rPr>
+    </w:lvl>
+    <w:lvl w:ilvl="4">
+      <w:start w:val="1"/>
+      <w:numFmt w:val="bullet"/>
+      <w:lvlText w:val="○"/>
+      <w:lvlJc w:val="left"/>
+      <w:pPr>
+        <w:ind w:left="3600" w:hanging="360"/>
+      </w:pPr>
+      <w:rPr>
+        <w:u w:val="none"/>
+      </w:rPr>
+    </w:lvl>
+    <w:lvl w:ilvl="5">
+      <w:start w:val="1"/>
+      <w:numFmt w:val="bullet"/>
+      <w:lvlText w:val="■"/>
+      <w:lvlJc w:val="left"/>
+      <w:pPr>
+        <w:ind w:left="4320" w:hanging="360"/>
+      </w:pPr>
+      <w:rPr>
+        <w:u w:val="none"/>
+      </w:rPr>
+    </w:lvl>
+    <w:lvl w:ilvl="6">
+      <w:start w:val="1"/>
+      <w:numFmt w:val="bullet"/>
+      <w:lvlText w:val="●"/>
+      <w:lvlJc w:val="left"/>
+      <w:pPr>
+        <w:ind w:left="5040" w:hanging="360"/>
+      </w:pPr>
+      <w:rPr>
+        <w:u w:val="none"/>
+      </w:rPr>
+    </w:lvl>
+    <w:lvl w:ilvl="7">
+      <w:start w:val="1"/>
+      <w:numFmt w:val="bullet"/>
+      <w:lvlText w:val="○"/>
+      <w:lvlJc w:val="left"/>
+      <w:pPr>
+        <w:ind w:left="5760" w:hanging="360"/>
+      </w:pPr>
+      <w:rPr>
+        <w:u w:val="none"/>
+      </w:rPr>
+    </w:lvl>
+    <w:lvl w:ilvl="8">
+      <w:start w:val="1"/>
+      <w:numFmt w:val="bullet"/>
+      <w:lvlText w:val="■"/>
+      <w:lvlJc w:val="left"/>
+      <w:pPr>
+        <w:ind w:left="6480" w:hanging="360"/>
+      </w:pPr>
+      <w:rPr>
+        <w:u w:val="none"/>
+      </w:rPr>
+    </w:lvl>
+  </w:abstractNum>
+  <w:abstractNum w:abstractNumId="2">
+    <w:lvl w:ilvl="0">
+      <w:start w:val="1"/>
+      <w:numFmt w:val="bullet"/>
+      <w:lvlText w:val="●"/>
+      <w:lvlJc w:val="left"/>
+      <w:pPr>
+        <w:ind w:left="720" w:hanging="360"/>
+      </w:pPr>
+      <w:rPr>
+        <w:u w:val="none"/>
+      </w:rPr>
+    </w:lvl>
+    <w:lvl w:ilvl="1">
+      <w:start w:val="1"/>
+      <w:numFmt w:val="bullet"/>
+      <w:lvlText w:val="○"/>
+      <w:lvlJc w:val="left"/>
+      <w:pPr>
+        <w:ind w:left="1440" w:hanging="360"/>
+      </w:pPr>
+      <w:rPr>
+        <w:u w:val="none"/>
+      </w:rPr>
+    </w:lvl>
+    <w:lvl w:ilvl="2">
+      <w:start w:val="1"/>
+      <w:numFmt w:val="bullet"/>
+      <w:lvlText w:val="■"/>
+      <w:lvlJc w:val="left"/>
+      <w:pPr>
+        <w:ind w:left="2160" w:hanging="360"/>
+      </w:pPr>
+      <w:rPr>
+        <w:u w:val="none"/>
+      </w:rPr>
+    </w:lvl>
+    <w:lvl w:ilvl="3">
+      <w:start w:val="1"/>
+      <w:numFmt w:val="bullet"/>
+      <w:lvlText w:val="●"/>
+      <w:lvlJc w:val="left"/>
+      <w:pPr>
+        <w:ind w:left="2880" w:hanging="360"/>
+      </w:pPr>
+      <w:rPr>
+        <w:u w:val="none"/>
+      </w:rPr>
+    </w:lvl>
+    <w:lvl w:ilvl="4">
+      <w:start w:val="1"/>
+      <w:numFmt w:val="bullet"/>
+      <w:lvlText w:val="○"/>
+      <w:lvlJc w:val="left"/>
+      <w:pPr>
+        <w:ind w:left="3600" w:hanging="360"/>
+      </w:pPr>
+      <w:rPr>
+        <w:u w:val="none"/>
+      </w:rPr>
+    </w:lvl>
+    <w:lvl w:ilvl="5">
+      <w:start w:val="1"/>
+      <w:numFmt w:val="bullet"/>
+      <w:lvlText w:val="■"/>
+      <w:lvlJc w:val="left"/>
+      <w:pPr>
+        <w:ind w:left="4320" w:hanging="360"/>
+      </w:pPr>
+      <w:rPr>
+        <w:u w:val="none"/>
+      </w:rPr>
+    </w:lvl>
+    <w:lvl w:ilvl="6">
+      <w:start w:val="1"/>
+      <w:numFmt w:val="bullet"/>
+      <w:lvlText w:val="●"/>
+      <w:lvlJc w:val="left"/>
+      <w:pPr>
+        <w:ind w:left="5040" w:hanging="360"/>
+      </w:pPr>
+      <w:rPr>
+        <w:u w:val="none"/>
+      </w:rPr>
+    </w:lvl>
+    <w:lvl w:ilvl="7">
+      <w:start w:val="1"/>
+      <w:numFmt w:val="bullet"/>
+      <w:lvlText w:val="○"/>
+      <w:lvlJc w:val="left"/>
+      <w:pPr>
+        <w:ind w:left="5760" w:hanging="360"/>
+      </w:pPr>
+      <w:rPr>
+        <w:u w:val="none"/>
+      </w:rPr>
+    </w:lvl>
+    <w:lvl w:ilvl="8">
+      <w:start w:val="1"/>
+      <w:numFmt w:val="bullet"/>
+      <w:lvlText w:val="■"/>
+      <w:lvlJc w:val="left"/>
+      <w:pPr>
+        <w:ind w:left="6480" w:hanging="360"/>
+      </w:pPr>
+      <w:rPr>
+        <w:u w:val="none"/>
+      </w:rPr>
+    </w:lvl>
+  </w:abstractNum>
+  <w:abstractNum w:abstractNumId="3">
+    <w:lvl w:ilvl="0">
+      <w:start w:val="1"/>
+      <w:numFmt w:val="bullet"/>
+      <w:lvlText w:val="●"/>
+      <w:lvlJc w:val="left"/>
+      <w:pPr>
+        <w:ind w:left="720" w:hanging="360"/>
+      </w:pPr>
+      <w:rPr>
+        <w:u w:val="none"/>
+      </w:rPr>
+    </w:lvl>
+    <w:lvl w:ilvl="1">
+      <w:start w:val="1"/>
+      <w:numFmt w:val="bullet"/>
+      <w:lvlText w:val="○"/>
+      <w:lvlJc w:val="left"/>
+      <w:pPr>
+        <w:ind w:left="1440" w:hanging="360"/>
+      </w:pPr>
+      <w:rPr>
+        <w:u w:val="none"/>
+      </w:rPr>
+    </w:lvl>
+    <w:lvl w:ilvl="2">
+      <w:start w:val="1"/>
+      <w:numFmt w:val="bullet"/>
+      <w:lvlText w:val="■"/>
+      <w:lvlJc w:val="left"/>
+      <w:pPr>
+        <w:ind w:left="2160" w:hanging="360"/>
+      </w:pPr>
+      <w:rPr>
+        <w:u w:val="none"/>
+      </w:rPr>
+    </w:lvl>
+    <w:lvl w:ilvl="3">
+      <w:start w:val="1"/>
+      <w:numFmt w:val="bullet"/>
+      <w:lvlText w:val="●"/>
+      <w:lvlJc w:val="left"/>
+      <w:pPr>
+        <w:ind w:left="2880" w:hanging="360"/>
+      </w:pPr>
+      <w:rPr>
+        <w:u w:val="none"/>
+      </w:rPr>
+    </w:lvl>
+    <w:lvl w:ilvl="4">
+      <w:start w:val="1"/>
+      <w:numFmt w:val="bullet"/>
+      <w:lvlText w:val="○"/>
+      <w:lvlJc w:val="left"/>
+      <w:pPr>
+        <w:ind w:left="3600" w:hanging="360"/>
+      </w:pPr>
+      <w:rPr>
+        <w:u w:val="none"/>
+      </w:rPr>
+    </w:lvl>
+    <w:lvl w:ilvl="5">
+      <w:start w:val="1"/>
+      <w:numFmt w:val="bullet"/>
+      <w:lvlText w:val="■"/>
+      <w:lvlJc w:val="left"/>
+      <w:pPr>
+        <w:ind w:left="4320" w:hanging="360"/>
+      </w:pPr>
+      <w:rPr>
+        <w:u w:val="none"/>
+      </w:rPr>
+    </w:lvl>
+    <w:lvl w:ilvl="6">
+      <w:start w:val="1"/>
+      <w:numFmt w:val="bullet"/>
+      <w:lvlText w:val="●"/>
+      <w:lvlJc w:val="left"/>
+      <w:pPr>
+        <w:ind w:left="5040" w:hanging="360"/>
+      </w:pPr>
+      <w:rPr>
+        <w:u w:val="none"/>
+      </w:rPr>
+    </w:lvl>
+    <w:lvl w:ilvl="7">
+      <w:start w:val="1"/>
+      <w:numFmt w:val="bullet"/>
+      <w:lvlText w:val="○"/>
+      <w:lvlJc w:val="left"/>
+      <w:pPr>
+        <w:ind w:left="5760" w:hanging="360"/>
+      </w:pPr>
+      <w:rPr>
+        <w:u w:val="none"/>
+      </w:rPr>
+    </w:lvl>
+    <w:lvl w:ilvl="8">
+      <w:start w:val="1"/>
+      <w:numFmt w:val="bullet"/>
+      <w:lvlText w:val="■"/>
+      <w:lvlJc w:val="left"/>
+      <w:pPr>
+        <w:ind w:left="6480" w:hanging="360"/>
+      </w:pPr>
+      <w:rPr>
+        <w:u w:val="none"/>
+      </w:rPr>
+    </w:lvl>
+  </w:abstractNum>
+  <w:abstractNum w:abstractNumId="4">
+    <w:lvl w:ilvl="0">
+      <w:start w:val="1"/>
+      <w:numFmt w:val="bullet"/>
+      <w:lvlText w:val="●"/>
+      <w:lvlJc w:val="left"/>
+      <w:pPr>
+        <w:ind w:left="720" w:hanging="360"/>
+      </w:pPr>
+      <w:rPr>
+        <w:u w:val="none"/>
+      </w:rPr>
+    </w:lvl>
+    <w:lvl w:ilvl="1">
+      <w:start w:val="1"/>
+      <w:numFmt w:val="bullet"/>
+      <w:lvlText w:val="○"/>
+      <w:lvlJc w:val="left"/>
+      <w:pPr>
+        <w:ind w:left="1440" w:hanging="360"/>
+      </w:pPr>
+      <w:rPr>
+        <w:u w:val="none"/>
+      </w:rPr>
+    </w:lvl>
+    <w:lvl w:ilvl="2">
+      <w:start w:val="1"/>
+      <w:numFmt w:val="bullet"/>
+      <w:lvlText w:val="■"/>
+      <w:lvlJc w:val="left"/>
+      <w:pPr>
+        <w:ind w:left="2160" w:hanging="360"/>
+      </w:pPr>
+      <w:rPr>
+        <w:u w:val="none"/>
+      </w:rPr>
+    </w:lvl>
+    <w:lvl w:ilvl="3">
+      <w:start w:val="1"/>
+      <w:numFmt w:val="bullet"/>
+      <w:lvlText w:val="●"/>
+      <w:lvlJc w:val="left"/>
+      <w:pPr>
+        <w:ind w:left="2880" w:hanging="360"/>
+      </w:pPr>
+      <w:rPr>
+        <w:u w:val="none"/>
+      </w:rPr>
+    </w:lvl>
+    <w:lvl w:ilvl="4">
+      <w:start w:val="1"/>
+      <w:numFmt w:val="bullet"/>
+      <w:lvlText w:val="○"/>
+      <w:lvlJc w:val="left"/>
+      <w:pPr>
+        <w:ind w:left="3600" w:hanging="360"/>
+      </w:pPr>
+      <w:rPr>
+        <w:u w:val="none"/>
+      </w:rPr>
+    </w:lvl>
+    <w:lvl w:ilvl="5">
+      <w:start w:val="1"/>
+      <w:numFmt w:val="bullet"/>
+      <w:lvlText w:val="■"/>
+      <w:lvlJc w:val="left"/>
+      <w:pPr>
+        <w:ind w:left="4320" w:hanging="360"/>
+      </w:pPr>
+      <w:rPr>
+        <w:u w:val="none"/>
+      </w:rPr>
+    </w:lvl>
+    <w:lvl w:ilvl="6">
+      <w:start w:val="1"/>
+      <w:numFmt w:val="bullet"/>
+      <w:lvlText w:val="●"/>
+      <w:lvlJc w:val="left"/>
+      <w:pPr>
+        <w:ind w:left="5040" w:hanging="360"/>
+      </w:pPr>
+      <w:rPr>
+        <w:u w:val="none"/>
+      </w:rPr>
+    </w:lvl>
+    <w:lvl w:ilvl="7">
+      <w:start w:val="1"/>
+      <w:numFmt w:val="bullet"/>
+      <w:lvlText w:val="○"/>
+      <w:lvlJc w:val="left"/>
+      <w:pPr>
+        <w:ind w:left="5760" w:hanging="360"/>
+      </w:pPr>
+      <w:rPr>
+        <w:u w:val="none"/>
+      </w:rPr>
+    </w:lvl>
+    <w:lvl w:ilvl="8">
+      <w:start w:val="1"/>
+      <w:numFmt w:val="bullet"/>
+      <w:lvlText w:val="■"/>
+      <w:lvlJc w:val="left"/>
+      <w:pPr>
+        <w:ind w:left="6480" w:hanging="360"/>
+      </w:pPr>
+      <w:rPr>
+        <w:u w:val="none"/>
+      </w:rPr>
+    </w:lvl>
+  </w:abstractNum>
+  <w:abstractNum w:abstractNumId="5">
+    <w:lvl w:ilvl="0">
+      <w:start w:val="1"/>
+      <w:numFmt w:val="bullet"/>
+      <w:lvlText w:val="●"/>
+      <w:lvlJc w:val="left"/>
+      <w:pPr>
+        <w:ind w:left="720" w:hanging="360"/>
+      </w:pPr>
+      <w:rPr>
+        <w:u w:val="none"/>
+      </w:rPr>
+    </w:lvl>
+    <w:lvl w:ilvl="1">
+      <w:start w:val="1"/>
+      <w:numFmt w:val="bullet"/>
+      <w:lvlText w:val="○"/>
+      <w:lvlJc w:val="left"/>
+      <w:pPr>
+        <w:ind w:left="1440" w:hanging="360"/>
+      </w:pPr>
+      <w:rPr>
+        <w:u w:val="none"/>
+      </w:rPr>
+    </w:lvl>
+    <w:lvl w:ilvl="2">
+      <w:start w:val="1"/>
+      <w:numFmt w:val="bullet"/>
+      <w:lvlText w:val="■"/>
+      <w:lvlJc w:val="left"/>
+      <w:pPr>
+        <w:ind w:left="2160" w:hanging="360"/>
+      </w:pPr>
+      <w:rPr>
+        <w:u w:val="none"/>
+      </w:rPr>
+    </w:lvl>
+    <w:lvl w:ilvl="3">
+      <w:start w:val="1"/>
+      <w:numFmt w:val="bullet"/>
+      <w:lvlText w:val="●"/>
+      <w:lvlJc w:val="left"/>
+      <w:pPr>
+        <w:ind w:left="2880" w:hanging="360"/>
+      </w:pPr>
+      <w:rPr>
+        <w:u w:val="none"/>
+      </w:rPr>
+    </w:lvl>
+    <w:lvl w:ilvl="4">
+      <w:start w:val="1"/>
+      <w:numFmt w:val="bullet"/>
+      <w:lvlText w:val="○"/>
+      <w:lvlJc w:val="left"/>
+      <w:pPr>
+        <w:ind w:left="3600" w:hanging="360"/>
+      </w:pPr>
+      <w:rPr>
+        <w:u w:val="none"/>
+      </w:rPr>
+    </w:lvl>
+    <w:lvl w:ilvl="5">
+      <w:start w:val="1"/>
+      <w:numFmt w:val="bullet"/>
+      <w:lvlText w:val="■"/>
+      <w:lvlJc w:val="left"/>
+      <w:pPr>
+        <w:ind w:left="4320" w:hanging="360"/>
+      </w:pPr>
+      <w:rPr>
+        <w:u w:val="none"/>
+      </w:rPr>
+    </w:lvl>
+    <w:lvl w:ilvl="6">
+      <w:start w:val="1"/>
+      <w:numFmt w:val="bullet"/>
+      <w:lvlText w:val="●"/>
+      <w:lvlJc w:val="left"/>
+      <w:pPr>
+        <w:ind w:left="5040" w:hanging="360"/>
+      </w:pPr>
+      <w:rPr>
+        <w:u w:val="none"/>
+      </w:rPr>
+    </w:lvl>
+    <w:lvl w:ilvl="7">
+      <w:start w:val="1"/>
+      <w:numFmt w:val="bullet"/>
+      <w:lvlText w:val="○"/>
+      <w:lvlJc w:val="left"/>
+      <w:pPr>
+        <w:ind w:left="5760" w:hanging="360"/>
+      </w:pPr>
+      <w:rPr>
+        <w:u w:val="none"/>
+      </w:rPr>
+    </w:lvl>
+    <w:lvl w:ilvl="8">
+      <w:start w:val="1"/>
+      <w:numFmt w:val="bullet"/>
+      <w:lvlText w:val="■"/>
+      <w:lvlJc w:val="left"/>
+      <w:pPr>
+        <w:ind w:left="6480" w:hanging="360"/>
+      </w:pPr>
+      <w:rPr>
+        <w:u w:val="none"/>
+      </w:rPr>
+    </w:lvl>
+  </w:abstractNum>
+  <w:abstractNum w:abstractNumId="6">
+    <w:lvl w:ilvl="0">
+      <w:start w:val="1"/>
+      <w:numFmt w:val="bullet"/>
+      <w:lvlText w:val="●"/>
+      <w:lvlJc w:val="left"/>
+      <w:pPr>
+        <w:ind w:left="720" w:hanging="360"/>
+      </w:pPr>
+      <w:rPr>
+        <w:u w:val="none"/>
+      </w:rPr>
+    </w:lvl>
+    <w:lvl w:ilvl="1">
+      <w:start w:val="1"/>
+      <w:numFmt w:val="bullet"/>
+      <w:lvlText w:val="○"/>
+      <w:lvlJc w:val="left"/>
+      <w:pPr>
+        <w:ind w:left="1440" w:hanging="360"/>
+      </w:pPr>
+      <w:rPr>
+        <w:u w:val="none"/>
+      </w:rPr>
+    </w:lvl>
+    <w:lvl w:ilvl="2">
+      <w:start w:val="1"/>
+      <w:numFmt w:val="bullet"/>
+      <w:lvlText w:val="■"/>
+      <w:lvlJc w:val="left"/>
+      <w:pPr>
+        <w:ind w:left="2160" w:hanging="360"/>
+      </w:pPr>
+      <w:rPr>
+        <w:u w:val="none"/>
+      </w:rPr>
+    </w:lvl>
+    <w:lvl w:ilvl="3">
+      <w:start w:val="1"/>
+      <w:numFmt w:val="bullet"/>
+      <w:lvlText w:val="●"/>
+      <w:lvlJc w:val="left"/>
+      <w:pPr>
+        <w:ind w:left="2880" w:hanging="360"/>
+      </w:pPr>
+      <w:rPr>
+        <w:u w:val="none"/>
+      </w:rPr>
+    </w:lvl>
+    <w:lvl w:ilvl="4">
+      <w:start w:val="1"/>
+      <w:numFmt w:val="bullet"/>
+      <w:lvlText w:val="○"/>
+      <w:lvlJc w:val="left"/>
+      <w:pPr>
+        <w:ind w:left="3600" w:hanging="360"/>
+      </w:pPr>
+      <w:rPr>
+        <w:u w:val="none"/>
+      </w:rPr>
+    </w:lvl>
+    <w:lvl w:ilvl="5">
+      <w:start w:val="1"/>
+      <w:numFmt w:val="bullet"/>
+      <w:lvlText w:val="■"/>
+      <w:lvlJc w:val="left"/>
+      <w:pPr>
+        <w:ind w:left="4320" w:hanging="360"/>
+      </w:pPr>
+      <w:rPr>
+        <w:u w:val="none"/>
+      </w:rPr>
+    </w:lvl>
+    <w:lvl w:ilvl="6">
+      <w:start w:val="1"/>
+      <w:numFmt w:val="bullet"/>
+      <w:lvlText w:val="●"/>
+      <w:lvlJc w:val="left"/>
+      <w:pPr>
+        <w:ind w:left="5040" w:hanging="360"/>
+      </w:pPr>
+      <w:rPr>
+        <w:u w:val="none"/>
+      </w:rPr>
+    </w:lvl>
+    <w:lvl w:ilvl="7">
+      <w:start w:val="1"/>
+      <w:numFmt w:val="bullet"/>
+      <w:lvlText w:val="○"/>
+      <w:lvlJc w:val="left"/>
+      <w:pPr>
+        <w:ind w:left="5760" w:hanging="360"/>
+      </w:pPr>
+      <w:rPr>
+        <w:u w:val="none"/>
+      </w:rPr>
+    </w:lvl>
+    <w:lvl w:ilvl="8">
+      <w:start w:val="1"/>
+      <w:numFmt w:val="bullet"/>
+      <w:lvlText w:val="■"/>
+      <w:lvlJc w:val="left"/>
+      <w:pPr>
+        <w:ind w:left="6480" w:hanging="360"/>
+      </w:pPr>
+      <w:rPr>
+        <w:u w:val="none"/>
+      </w:rPr>
+    </w:lvl>
+  </w:abstractNum>
+  <w:num w:numId="1">
+    <w:abstractNumId w:val="1"/>
+  </w:num>
+  <w:num w:numId="2">
+    <w:abstractNumId w:val="2"/>
+  </w:num>
+  <w:num w:numId="3">
+    <w:abstractNumId w:val="3"/>
+  </w:num>
+  <w:num w:numId="4">
+    <w:abstractNumId w:val="4"/>
+  </w:num>
+  <w:num w:numId="5">
+    <w:abstractNumId w:val="5"/>
+  </w:num>
+  <w:num w:numId="6">
+    <w:abstractNumId w:val="6"/>
+  </w:num>
+</w:numbering>
 </file>
 
 <file path=word/styles.xml><?xml version="1.0" encoding="utf-8"?>

</xml_diff>